<commit_message>
v15.0.0: new toolkit packages, Austin setup samples, live previews
Hosts ctc-chapter-setup 1.6.0 (now a plugin, eight questions in one
message), ctc-newsletter 2.5.1 and ctc-partner-map 2.2.0. Install uploads
all three as plugins. Copy follows the new skills: assembly needs both
files, picks two to four opportunities, harvest companion file, last
month's opportunities file, LinkedIn asked every run, partner map once.
Austin settings and plan replace the Denver samples; registry sample from
2.5.1; partner map rebuilt with 2.2.0.

Previews open the file itself: Excel-style grids with sheet tabs and Word
documents as text, zoomable, built by tools/build_previews.py. The PNG
renders and screenshots are removed.

Co-Authored-By: Claude Opus 5.5 <noreply@anthropic.com>
</commit_message>
<xml_diff>
--- a/downloads/samples/Chapter_Plan_SAMPLE.docx
+++ b/downloads/samples/Chapter_Plan_SAMPLE.docx
@@ -15,7 +15,7 @@
           <w:sz w:val="36"/>
           <w:szCs w:val="36"/>
         </w:rPr>
-        <w:t xml:space="preserve">Climate Tech Denver</w:t>
+        <w:t xml:space="preserve">Climate Tech Austin</w:t>
       </w:r>
     </w:p>
     <w:p>
@@ -34,7 +34,7 @@
     </w:p>
     <w:p>
       <w:pPr>
-        <w:spacing w:after="220"/>
+        <w:spacing w:after="200"/>
       </w:pPr>
       <w:r>
         <w:rPr>
@@ -45,7 +45,33 @@
           <w:sz w:val="18"/>
           <w:szCs w:val="18"/>
         </w:rPr>
-        <w:t xml:space="preserve">Tuesday, August 11, 2026 to Monday, August 24, 2026</w:t>
+        <w:t xml:space="preserve">Thursday, October 1, 2026 to Wednesday, October 14, 2026</w:t>
+      </w:r>
+    </w:p>
+    <w:p>
+      <w:pPr>
+        <w:spacing w:after="100"/>
+      </w:pPr>
+      <w:r>
+        <w:rPr>
+          <w:rFonts w:ascii="Calibri" w:cs="Calibri" w:eastAsia="Calibri" w:hAnsi="Calibri"/>
+          <w:sz w:val="21"/>
+          <w:szCs w:val="21"/>
+        </w:rPr>
+        <w:t xml:space="preserve">Bulleted lines are the steps the toolkit and the Climate Tech Cities team depend on. The grey notes are advice: take what is useful and skip the rest. You know your city better than this document does.</w:t>
+      </w:r>
+    </w:p>
+    <w:p>
+      <w:pPr>
+        <w:spacing w:after="160"/>
+      </w:pPr>
+      <w:r>
+        <w:rPr>
+          <w:rFonts w:ascii="Calibri" w:cs="Calibri" w:eastAsia="Calibri" w:hAnsi="Calibri"/>
+          <w:sz w:val="21"/>
+          <w:szCs w:val="21"/>
+        </w:rPr>
+        <w:t xml:space="preserve">The full manual is the chapter launch playbook: https://joshuakeum9-cell.github.io/chapter-launch-playbook/. This plan is the short version with your dates in it.</w:t>
       </w:r>
     </w:p>
     <w:p>
@@ -80,7 +106,7 @@
           <w:sz w:val="21"/>
           <w:szCs w:val="21"/>
         </w:rPr>
-        <w:t xml:space="preserve">Create a project in Claude.</w:t>
+        <w:t xml:space="preserve">Create a project in Claude and name it Climate Tech Austin.</w:t>
       </w:r>
     </w:p>
     <w:p>
@@ -98,7 +124,7 @@
           <w:sz w:val="21"/>
           <w:szCs w:val="21"/>
         </w:rPr>
-        <w:t xml:space="preserve">Add Chapter_Settings_Denver.docx to that project as a context file. Every skill reads it from there.</w:t>
+        <w:t xml:space="preserve">Add Chapter_Settings_Austin.docx to that project as a context file, in project settings under add files, not attached to a chat. Every skill reads it from there, so nothing else in the toolkit works until it is in.</w:t>
       </w:r>
     </w:p>
     <w:p>
@@ -134,7 +160,7 @@
           <w:sz w:val="21"/>
           <w:szCs w:val="21"/>
         </w:rPr>
-        <w:t xml:space="preserve">Install the Claude Chrome extension. Some event sites require it.</w:t>
+        <w:t xml:space="preserve">Install the Claude in Chrome extension. The weekly harvest needs it to read Luma and Eventbrite.</w:t>
       </w:r>
     </w:p>
     <w:p>
@@ -185,7 +211,7 @@
           <w:sz w:val="20"/>
           <w:szCs w:val="20"/>
         </w:rPr>
-        <w:t xml:space="preserve">Add the settings file to the project, not to a single conversation. A file attached to one conversation is not available in the next one.</w:t>
+        <w:t xml:space="preserve">The playbook's Install page has these in order with links. Skills only appear in a fresh conversation, so start a new one after installing.</w:t>
       </w:r>
     </w:p>
     <w:p>
@@ -362,7 +388,7 @@
                 <w:sz w:val="20"/>
                 <w:szCs w:val="20"/>
               </w:rPr>
-              <w:t xml:space="preserve">August 11 to August 17</w:t>
+              <w:t xml:space="preserve">October 1 to October 7</w:t>
             </w:r>
           </w:p>
         </w:tc>
@@ -389,7 +415,7 @@
                 <w:sz w:val="20"/>
                 <w:szCs w:val="20"/>
               </w:rPr>
-              <w:t xml:space="preserve">Logo, then ask the founders for your Substack.</w:t>
+              <w:t xml:space="preserve">Logo, then Substack.</w:t>
             </w:r>
           </w:p>
         </w:tc>
@@ -448,7 +474,7 @@
                 <w:sz w:val="20"/>
                 <w:szCs w:val="20"/>
               </w:rPr>
-              <w:t xml:space="preserve">August 18 to August 24</w:t>
+              <w:t xml:space="preserve">October 8 to October 14</w:t>
             </w:r>
           </w:p>
         </w:tc>
@@ -534,7 +560,7 @@
                 <w:sz w:val="20"/>
                 <w:szCs w:val="20"/>
               </w:rPr>
-              <w:t xml:space="preserve">Every Thursday</w:t>
+              <w:t xml:space="preserve">Every Tuesday</w:t>
             </w:r>
           </w:p>
         </w:tc>
@@ -819,7 +845,7 @@
                 <w:sz w:val="20"/>
                 <w:szCs w:val="20"/>
               </w:rPr>
-              <w:t xml:space="preserve">Run ctc-partner-map.</w:t>
+              <w:t xml:space="preserve">Partners, if you want them.</w:t>
             </w:r>
           </w:p>
         </w:tc>
@@ -855,7 +881,7 @@
           <w:sz w:val="21"/>
           <w:szCs w:val="21"/>
         </w:rPr>
-        <w:t xml:space="preserve">August 11 to August 17</w:t>
+        <w:t xml:space="preserve">October 1 to October 7</w:t>
       </w:r>
     </w:p>
     <w:p>
@@ -890,7 +916,7 @@
           <w:sz w:val="21"/>
           <w:szCs w:val="21"/>
         </w:rPr>
-        <w:t xml:space="preserve">Open the chapter launch site and enter your city. The logo prompt fills in.</w:t>
+        <w:t xml:space="preserve">Open the Logo step on the chapter launch playbook. It has the prompt with your city in it, the reference images to attach, and the full walkthrough.</w:t>
       </w:r>
     </w:p>
     <w:p>
@@ -908,7 +934,7 @@
           <w:sz w:val="21"/>
           <w:szCs w:val="21"/>
         </w:rPr>
-        <w:t xml:space="preserve">Paste the prompt into ChatGPT with the five reference images attached. Ask for ten concepts.</w:t>
+        <w:t xml:space="preserve">Generate concepts in ChatGPT and pick one.</w:t>
       </w:r>
     </w:p>
     <w:p>
@@ -926,7 +952,57 @@
           <w:sz w:val="21"/>
           <w:szCs w:val="21"/>
         </w:rPr>
-        <w:t xml:space="preserve">Review the concepts at icon size.</w:t>
+        <w:t xml:space="preserve">Send your pick to the Climate Tech Cities team for sign-off. Nothing with the logo on it goes public until it is approved: it ends up on the Substack, the website, and every event graphic, so changing it later means changing it everywhere.</w:t>
+      </w:r>
+    </w:p>
+    <w:p>
+      <w:pPr>
+        <w:spacing w:after="120"/>
+      </w:pPr>
+      <w:r>
+        <w:rPr>
+          <w:rFonts w:ascii="Calibri" w:cs="Calibri" w:eastAsia="Calibri" w:hAnsi="Calibri"/>
+          <w:sz w:val="21"/>
+          <w:szCs w:val="21"/>
+        </w:rPr>
+        <w:t xml:space="preserve"/>
+      </w:r>
+    </w:p>
+    <w:p>
+      <w:pPr>
+        <w:pBdr>
+          <w:left w:val="single" w:color="0F6E6E" w:sz="12" w:space="8"/>
+        </w:pBdr>
+        <w:spacing w:after="120"/>
+        <w:ind w:left="160"/>
+      </w:pPr>
+      <w:r>
+        <w:rPr>
+          <w:rFonts w:ascii="Calibri" w:cs="Calibri" w:eastAsia="Calibri" w:hAnsi="Calibri"/>
+          <w:i/>
+          <w:iCs/>
+          <w:color w:val="555555"/>
+          <w:sz w:val="20"/>
+          <w:szCs w:val="20"/>
+        </w:rPr>
+        <w:t xml:space="preserve">Judge concepts at icon size. That is the size most people will ever see it at.</w:t>
+      </w:r>
+    </w:p>
+    <w:p>
+      <w:pPr>
+        <w:pStyle w:val="Heading2"/>
+        <w:spacing w:after="120" w:before="260"/>
+      </w:pPr>
+      <w:r>
+        <w:rPr>
+          <w:rFonts w:ascii="Calibri" w:cs="Calibri" w:eastAsia="Calibri" w:hAnsi="Calibri"/>
+          <w:b/>
+          <w:bCs/>
+          <w:color w:val="0F6E6E"/>
+          <w:sz w:val="24"/>
+          <w:szCs w:val="24"/>
+        </w:rPr>
+        <w:t xml:space="preserve">Substack</w:t>
       </w:r>
     </w:p>
     <w:p>
@@ -944,7 +1020,7 @@
           <w:sz w:val="21"/>
           <w:szCs w:val="21"/>
         </w:rPr>
-        <w:t xml:space="preserve">Send your chosen concept to the Climate Tech Cities founders and wait for approval.</w:t>
+        <w:t xml:space="preserve">Once the logo is approved, send it and your chapter name (Climate Tech Austin) to the Climate Tech Cities team. They create the Substack publication and send you the login.</w:t>
       </w:r>
     </w:p>
     <w:p>
@@ -962,57 +1038,7 @@
           <w:sz w:val="21"/>
           <w:szCs w:val="21"/>
         </w:rPr>
-        <w:t xml:space="preserve">Export SVG and transparent PNG at three sizes.</w:t>
-      </w:r>
-    </w:p>
-    <w:p>
-      <w:pPr>
-        <w:spacing w:after="120"/>
-      </w:pPr>
-      <w:r>
-        <w:rPr>
-          <w:rFonts w:ascii="Calibri" w:cs="Calibri" w:eastAsia="Calibri" w:hAnsi="Calibri"/>
-          <w:sz w:val="21"/>
-          <w:szCs w:val="21"/>
-        </w:rPr>
-        <w:t xml:space="preserve"/>
-      </w:r>
-    </w:p>
-    <w:p>
-      <w:pPr>
-        <w:pBdr>
-          <w:left w:val="single" w:color="0F6E6E" w:sz="12" w:space="8"/>
-        </w:pBdr>
-        <w:spacing w:after="120"/>
-        <w:ind w:left="160"/>
-      </w:pPr>
-      <w:r>
-        <w:rPr>
-          <w:rFonts w:ascii="Calibri" w:cs="Calibri" w:eastAsia="Calibri" w:hAnsi="Calibri"/>
-          <w:i/>
-          <w:iCs/>
-          <w:color w:val="555555"/>
-          <w:sz w:val="20"/>
-          <w:szCs w:val="20"/>
-        </w:rPr>
-        <w:t xml:space="preserve">Do not publish the logo anywhere until it is approved.</w:t>
-      </w:r>
-    </w:p>
-    <w:p>
-      <w:pPr>
-        <w:pStyle w:val="Heading2"/>
-        <w:spacing w:after="120" w:before="260"/>
-      </w:pPr>
-      <w:r>
-        <w:rPr>
-          <w:rFonts w:ascii="Calibri" w:cs="Calibri" w:eastAsia="Calibri" w:hAnsi="Calibri"/>
-          <w:b/>
-          <w:bCs/>
-          <w:color w:val="0F6E6E"/>
-          <w:sz w:val="24"/>
-          <w:szCs w:val="24"/>
-        </w:rPr>
-        <w:t xml:space="preserve">Substack</w:t>
+        <w:t xml:space="preserve">Confirm the web address with them at the same time. Your settings file records austin.climatetechcities.com, but there is no fixed rule yet, and once other chapters link to the address it cannot change quietly.</w:t>
       </w:r>
     </w:p>
     <w:p>
@@ -1030,7 +1056,90 @@
           <w:sz w:val="21"/>
           <w:szCs w:val="21"/>
         </w:rPr>
-        <w:t xml:space="preserve">Once the logo is approved, send the Climate Tech Cities founders four things: the approved logo, the chapter name (Climate Tech Denver), your name (Priya Raman), and your web address preference (denverclimatetech.substack.com).</w:t>
+        <w:t xml:space="preserve">When you have the login, ask Claude in your project: "walk me through Substack setup" and "draft my welcome email". Both read your settings file.</w:t>
+      </w:r>
+    </w:p>
+    <w:p>
+      <w:pPr>
+        <w:spacing w:after="120"/>
+      </w:pPr>
+      <w:r>
+        <w:rPr>
+          <w:rFonts w:ascii="Calibri" w:cs="Calibri" w:eastAsia="Calibri" w:hAnsi="Calibri"/>
+          <w:sz w:val="21"/>
+          <w:szCs w:val="21"/>
+        </w:rPr>
+        <w:t xml:space="preserve"/>
+      </w:r>
+    </w:p>
+    <w:p>
+      <w:pPr>
+        <w:pBdr>
+          <w:left w:val="single" w:color="0F6E6E" w:sz="12" w:space="8"/>
+        </w:pBdr>
+        <w:spacing w:after="120"/>
+        <w:ind w:left="160"/>
+      </w:pPr>
+      <w:r>
+        <w:rPr>
+          <w:rFonts w:ascii="Calibri" w:cs="Calibri" w:eastAsia="Calibri" w:hAnsi="Calibri"/>
+          <w:i/>
+          <w:iCs/>
+          <w:color w:val="555555"/>
+          <w:sz w:val="20"/>
+          <w:szCs w:val="20"/>
+        </w:rPr>
+        <w:t xml:space="preserve">Two settings worth doing early: the sender name as Test Name rather than the chapter, because email from a person gets opened more often, and the welcome email, because Substack sends it to every new subscriber automatically and it is otherwise blank.</w:t>
+      </w:r>
+    </w:p>
+    <w:p>
+      <w:pPr>
+        <w:pStyle w:val="Heading1"/>
+        <w:spacing w:after="160" w:before="320"/>
+      </w:pPr>
+      <w:r>
+        <w:rPr>
+          <w:rFonts w:ascii="Calibri" w:cs="Calibri" w:eastAsia="Calibri" w:hAnsi="Calibri"/>
+          <w:b/>
+          <w:bCs/>
+          <w:color w:val="0F6E6E"/>
+          <w:sz w:val="30"/>
+          <w:szCs w:val="30"/>
+        </w:rPr>
+        <w:t xml:space="preserve">Week 2</w:t>
+      </w:r>
+    </w:p>
+    <w:p>
+      <w:pPr>
+        <w:spacing w:after="140"/>
+      </w:pPr>
+      <w:r>
+        <w:rPr>
+          <w:rFonts w:ascii="Calibri" w:cs="Calibri" w:eastAsia="Calibri" w:hAnsi="Calibri"/>
+          <w:i/>
+          <w:iCs/>
+          <w:color w:val="555555"/>
+          <w:sz w:val="21"/>
+          <w:szCs w:val="21"/>
+        </w:rPr>
+        <w:t xml:space="preserve">October 8 to October 14</w:t>
+      </w:r>
+    </w:p>
+    <w:p>
+      <w:pPr>
+        <w:pStyle w:val="Heading2"/>
+        <w:spacing w:after="120" w:before="260"/>
+      </w:pPr>
+      <w:r>
+        <w:rPr>
+          <w:rFonts w:ascii="Calibri" w:cs="Calibri" w:eastAsia="Calibri" w:hAnsi="Calibri"/>
+          <w:b/>
+          <w:bCs/>
+          <w:color w:val="0F6E6E"/>
+          <w:sz w:val="24"/>
+          <w:szCs w:val="24"/>
+        </w:rPr>
+        <w:t xml:space="preserve">Source list</w:t>
       </w:r>
     </w:p>
     <w:p>
@@ -1048,7 +1157,7 @@
           <w:sz w:val="21"/>
           <w:szCs w:val="21"/>
         </w:rPr>
-        <w:t xml:space="preserve">They create the publication and send you the publication and your login. You do not create it yourself.</w:t>
+        <w:t xml:space="preserve">Run ctc-source-map in your project. It asks whether you have calendar links of your own, researches the rest, and hands back your source list to review.</w:t>
       </w:r>
     </w:p>
     <w:p>
@@ -1066,7 +1175,57 @@
           <w:sz w:val="21"/>
           <w:szCs w:val="21"/>
         </w:rPr>
-        <w:t xml:space="preserve">Set the sender name to Priya Raman.</w:t>
+        <w:t xml:space="preserve">When it looks right, add CTC_Source_Registry_Austin.xlsx to your project as a context file. The weekly harvest reads it and stops without it.</w:t>
+      </w:r>
+    </w:p>
+    <w:p>
+      <w:pPr>
+        <w:spacing w:after="120"/>
+      </w:pPr>
+      <w:r>
+        <w:rPr>
+          <w:rFonts w:ascii="Calibri" w:cs="Calibri" w:eastAsia="Calibri" w:hAnsi="Calibri"/>
+          <w:sz w:val="21"/>
+          <w:szCs w:val="21"/>
+        </w:rPr>
+        <w:t xml:space="preserve"/>
+      </w:r>
+    </w:p>
+    <w:p>
+      <w:pPr>
+        <w:pBdr>
+          <w:left w:val="single" w:color="0F6E6E" w:sz="12" w:space="8"/>
+        </w:pBdr>
+        <w:spacing w:after="120"/>
+        <w:ind w:left="160"/>
+      </w:pPr>
+      <w:r>
+        <w:rPr>
+          <w:rFonts w:ascii="Calibri" w:cs="Calibri" w:eastAsia="Calibri" w:hAnsi="Calibri"/>
+          <w:i/>
+          <w:iCs/>
+          <w:color w:val="555555"/>
+          <w:sz w:val="20"/>
+          <w:szCs w:val="20"/>
+        </w:rPr>
+        <w:t xml:space="preserve">Every future issue is built from this list, so it is worth an hour now. Sources go quiet without telling anyone, which is why the schedule has a refresh every three months.</w:t>
+      </w:r>
+    </w:p>
+    <w:p>
+      <w:pPr>
+        <w:pStyle w:val="Heading2"/>
+        <w:spacing w:after="120" w:before="260"/>
+      </w:pPr>
+      <w:r>
+        <w:rPr>
+          <w:rFonts w:ascii="Calibri" w:cs="Calibri" w:eastAsia="Calibri" w:hAnsi="Calibri"/>
+          <w:b/>
+          <w:bCs/>
+          <w:color w:val="0F6E6E"/>
+          <w:sz w:val="24"/>
+          <w:szCs w:val="24"/>
+        </w:rPr>
+        <w:t xml:space="preserve">Subscriber list</w:t>
       </w:r>
     </w:p>
     <w:p>
@@ -1084,7 +1243,73 @@
           <w:sz w:val="21"/>
           <w:szCs w:val="21"/>
         </w:rPr>
-        <w:t xml:space="preserve">Write the welcome email. Substack sends it to every new subscriber.</w:t>
+        <w:t xml:space="preserve">Add your first subscribers in Substack and start with whoever you have. A first issue going to a few dozen people is normal.</w:t>
+      </w:r>
+    </w:p>
+    <w:p>
+      <w:pPr>
+        <w:spacing w:after="120"/>
+      </w:pPr>
+      <w:r>
+        <w:rPr>
+          <w:rFonts w:ascii="Calibri" w:cs="Calibri" w:eastAsia="Calibri" w:hAnsi="Calibri"/>
+          <w:sz w:val="21"/>
+          <w:szCs w:val="21"/>
+        </w:rPr>
+        <w:t xml:space="preserve"/>
+      </w:r>
+    </w:p>
+    <w:p>
+      <w:pPr>
+        <w:pBdr>
+          <w:left w:val="single" w:color="0F6E6E" w:sz="12" w:space="8"/>
+        </w:pBdr>
+        <w:spacing w:after="120"/>
+        <w:ind w:left="160"/>
+      </w:pPr>
+      <w:r>
+        <w:rPr>
+          <w:rFonts w:ascii="Calibri" w:cs="Calibri" w:eastAsia="Calibri" w:hAnsi="Calibri"/>
+          <w:i/>
+          <w:iCs/>
+          <w:color w:val="555555"/>
+          <w:sz w:val="20"/>
+          <w:szCs w:val="20"/>
+        </w:rPr>
+        <w:t xml:space="preserve">Your own network, asked one by one, is usually most of the early list and converts better than a public post. If you are thinking of importing a list from somewhere, ask Claude "how do I build my list" first: there are consent rules, and stricter ones for chapters in the UK and EU.</w:t>
+      </w:r>
+    </w:p>
+    <w:p>
+      <w:pPr>
+        <w:pStyle w:val="Heading2"/>
+        <w:spacing w:after="120" w:before="260"/>
+      </w:pPr>
+      <w:r>
+        <w:rPr>
+          <w:rFonts w:ascii="Calibri" w:cs="Calibri" w:eastAsia="Calibri" w:hAnsi="Calibri"/>
+          <w:b/>
+          <w:bCs/>
+          <w:color w:val="0F6E6E"/>
+          <w:sz w:val="24"/>
+          <w:szCs w:val="24"/>
+        </w:rPr>
+        <w:t xml:space="preserve">First issue</w:t>
+      </w:r>
+    </w:p>
+    <w:p>
+      <w:pPr>
+        <w:spacing w:after="140"/>
+      </w:pPr>
+      <w:r>
+        <w:rPr>
+          <w:rFonts w:ascii="Calibri" w:cs="Calibri" w:eastAsia="Calibri" w:hAnsi="Calibri"/>
+          <w:i/>
+          <w:iCs/>
+          <w:color w:val="555555"/>
+          <w:sz w:val="21"/>
+          <w:szCs w:val="21"/>
+        </w:rPr>
+        <w:t xml:space="preserve">Tuesday, October 13, 2026</w:t>
       </w:r>
     </w:p>
     <w:p>
@@ -1102,7 +1327,7 @@
           <w:sz w:val="21"/>
           <w:szCs w:val="21"/>
         </w:rPr>
-        <w:t xml:space="preserve">Add the one-line description, and turn off pledges and recommendations.</w:t>
+        <w:t xml:space="preserve">Say "run the newsletter" in your project. The toolkit runs the harvest, hands you the cut, drafts the issue, and stops wherever your input is needed.</w:t>
       </w:r>
     </w:p>
     <w:p>
@@ -1135,7 +1360,7 @@
           <w:sz w:val="20"/>
           <w:szCs w:val="20"/>
         </w:rPr>
-        <w:t xml:space="preserve">For any of these steps, ask Claude in your project: "walk me through Substack setup", "draft my welcome email", "how do I build my list". Each reads your settings file.</w:t>
+        <w:t xml:space="preserve">A first issue is small and mostly a note about why the newsletter exists. That is the right shape, not a failure. Do not wait until there are more events.</w:t>
       </w:r>
     </w:p>
     <w:p>
@@ -1152,7 +1377,7 @@
           <w:sz w:val="30"/>
           <w:szCs w:val="30"/>
         </w:rPr>
-        <w:t xml:space="preserve">Week 2</w:t>
+        <w:t xml:space="preserve">Every week</w:t>
       </w:r>
     </w:p>
     <w:p>
@@ -1162,344 +1387,10 @@
       <w:r>
         <w:rPr>
           <w:rFonts w:ascii="Calibri" w:cs="Calibri" w:eastAsia="Calibri" w:hAnsi="Calibri"/>
-          <w:i/>
-          <w:iCs/>
-          <w:color w:val="555555"/>
-          <w:sz w:val="21"/>
-          <w:szCs w:val="21"/>
-        </w:rPr>
-        <w:t xml:space="preserve">August 18 to August 24</w:t>
-      </w:r>
-    </w:p>
-    <w:p>
-      <w:pPr>
-        <w:pStyle w:val="Heading2"/>
-        <w:spacing w:after="120" w:before="260"/>
-      </w:pPr>
-      <w:r>
-        <w:rPr>
-          <w:rFonts w:ascii="Calibri" w:cs="Calibri" w:eastAsia="Calibri" w:hAnsi="Calibri"/>
-          <w:b/>
-          <w:bCs/>
-          <w:color w:val="0F6E6E"/>
-          <w:sz w:val="24"/>
-          <w:szCs w:val="24"/>
-        </w:rPr>
-        <w:t xml:space="preserve">Source list</w:t>
-      </w:r>
-    </w:p>
-    <w:p>
-      <w:pPr>
-        <w:pStyle w:val="ListParagraph"/>
-        <w:numPr>
-          <w:ilvl w:val="0"/>
-          <w:numId w:val="2"/>
-        </w:numPr>
-        <w:spacing w:after="80"/>
-      </w:pPr>
-      <w:r>
-        <w:rPr>
-          <w:rFonts w:ascii="Calibri" w:cs="Calibri" w:eastAsia="Calibri" w:hAnsi="Calibri"/>
-          <w:sz w:val="21"/>
-          <w:szCs w:val="21"/>
-        </w:rPr>
-        <w:t xml:space="preserve">Run ctc-source-map.</w:t>
-      </w:r>
-    </w:p>
-    <w:p>
-      <w:pPr>
-        <w:pStyle w:val="ListParagraph"/>
-        <w:numPr>
-          <w:ilvl w:val="0"/>
-          <w:numId w:val="2"/>
-        </w:numPr>
-        <w:spacing w:after="80"/>
-      </w:pPr>
-      <w:r>
-        <w:rPr>
-          <w:rFonts w:ascii="Calibri" w:cs="Calibri" w:eastAsia="Calibri" w:hAnsi="Calibri"/>
-          <w:sz w:val="21"/>
-          <w:szCs w:val="21"/>
-        </w:rPr>
-        <w:t xml:space="preserve">It offers three options: paste your own calendar links, paste some and let it research the rest, or let it research everything.</w:t>
-      </w:r>
-    </w:p>
-    <w:p>
-      <w:pPr>
-        <w:pStyle w:val="ListParagraph"/>
-        <w:numPr>
-          <w:ilvl w:val="0"/>
-          <w:numId w:val="2"/>
-        </w:numPr>
-        <w:spacing w:after="80"/>
-      </w:pPr>
-      <w:r>
-        <w:rPr>
-          <w:rFonts w:ascii="Calibri" w:cs="Calibri" w:eastAsia="Calibri" w:hAnsi="Calibri"/>
-          <w:sz w:val="21"/>
-          <w:szCs w:val="21"/>
-        </w:rPr>
-        <w:t xml:space="preserve">Review the source list it returns and add anything it missed.</w:t>
-      </w:r>
-    </w:p>
-    <w:p>
-      <w:pPr>
-        <w:pStyle w:val="ListParagraph"/>
-        <w:numPr>
-          <w:ilvl w:val="0"/>
-          <w:numId w:val="2"/>
-        </w:numPr>
-        <w:spacing w:after="80"/>
-      </w:pPr>
-      <w:r>
-        <w:rPr>
-          <w:rFonts w:ascii="Calibri" w:cs="Calibri" w:eastAsia="Calibri" w:hAnsi="Calibri"/>
-          <w:sz w:val="21"/>
-          <w:szCs w:val="21"/>
-        </w:rPr>
-        <w:t xml:space="preserve">Target 25 to 30 verified sources.</w:t>
-      </w:r>
-    </w:p>
-    <w:p>
-      <w:pPr>
-        <w:pStyle w:val="ListParagraph"/>
-        <w:numPr>
-          <w:ilvl w:val="0"/>
-          <w:numId w:val="2"/>
-        </w:numPr>
-        <w:spacing w:after="80"/>
-      </w:pPr>
-      <w:r>
-        <w:rPr>
-          <w:rFonts w:ascii="Calibri" w:cs="Calibri" w:eastAsia="Calibri" w:hAnsi="Calibri"/>
-          <w:sz w:val="21"/>
-          <w:szCs w:val="21"/>
-        </w:rPr>
-        <w:t xml:space="preserve">Add the file it makes to your project as a context file, and write its name under Source list file in section 3 of your settings file.</w:t>
-      </w:r>
-    </w:p>
-    <w:p>
-      <w:pPr>
-        <w:pStyle w:val="ListParagraph"/>
-        <w:numPr>
-          <w:ilvl w:val="0"/>
-          <w:numId w:val="2"/>
-        </w:numPr>
-        <w:spacing w:after="80"/>
-      </w:pPr>
-      <w:r>
-        <w:rPr>
-          <w:rFonts w:ascii="Calibri" w:cs="Calibri" w:eastAsia="Calibri" w:hAnsi="Calibri"/>
-          <w:sz w:val="21"/>
-          <w:szCs w:val="21"/>
-        </w:rPr>
-        <w:t xml:space="preserve">Re-run it once every three months. Refreshing the sources is a quarterly task, not a monthly one.</w:t>
-      </w:r>
-    </w:p>
-    <w:p>
-      <w:pPr>
-        <w:pStyle w:val="Heading2"/>
-        <w:spacing w:after="120" w:before="260"/>
-      </w:pPr>
-      <w:r>
-        <w:rPr>
-          <w:rFonts w:ascii="Calibri" w:cs="Calibri" w:eastAsia="Calibri" w:hAnsi="Calibri"/>
-          <w:b/>
-          <w:bCs/>
-          <w:color w:val="0F6E6E"/>
-          <w:sz w:val="24"/>
-          <w:szCs w:val="24"/>
-        </w:rPr>
-        <w:t xml:space="preserve">Subscriber list</w:t>
-      </w:r>
-    </w:p>
-    <w:p>
-      <w:pPr>
-        <w:pStyle w:val="ListParagraph"/>
-        <w:numPr>
-          <w:ilvl w:val="0"/>
-          <w:numId w:val="2"/>
-        </w:numPr>
-        <w:spacing w:after="80"/>
-      </w:pPr>
-      <w:r>
-        <w:rPr>
-          <w:rFonts w:ascii="Calibri" w:cs="Calibri" w:eastAsia="Calibri" w:hAnsi="Calibri"/>
-          <w:sz w:val="21"/>
-          <w:szCs w:val="21"/>
-        </w:rPr>
-        <w:t xml:space="preserve">Add only people who gave you their email where a newsletter was implied: event RSVPs, sign-up forms, direct requests.</w:t>
-      </w:r>
-    </w:p>
-    <w:p>
-      <w:pPr>
-        <w:pStyle w:val="ListParagraph"/>
-        <w:numPr>
-          <w:ilvl w:val="0"/>
-          <w:numId w:val="2"/>
-        </w:numPr>
-        <w:spacing w:after="80"/>
-      </w:pPr>
-      <w:r>
-        <w:rPr>
-          <w:rFonts w:ascii="Calibri" w:cs="Calibri" w:eastAsia="Calibri" w:hAnsi="Calibri"/>
-          <w:sz w:val="21"/>
-          <w:szCs w:val="21"/>
-        </w:rPr>
-        <w:t xml:space="preserve">Do not import conference lists, scraped lists, or contacts who have not been asked.</w:t>
-      </w:r>
-    </w:p>
-    <w:p>
-      <w:pPr>
-        <w:pStyle w:val="ListParagraph"/>
-        <w:numPr>
-          <w:ilvl w:val="0"/>
-          <w:numId w:val="2"/>
-        </w:numPr>
-        <w:spacing w:after="80"/>
-      </w:pPr>
-      <w:r>
-        <w:rPr>
-          <w:rFonts w:ascii="Calibri" w:cs="Calibri" w:eastAsia="Calibri" w:hAnsi="Calibri"/>
-          <w:sz w:val="21"/>
-          <w:szCs w:val="21"/>
-        </w:rPr>
-        <w:t xml:space="preserve">Ask your own network individually.</w:t>
-      </w:r>
-    </w:p>
-    <w:p>
-      <w:pPr>
-        <w:pStyle w:val="Heading2"/>
-        <w:spacing w:after="120" w:before="260"/>
-      </w:pPr>
-      <w:r>
-        <w:rPr>
-          <w:rFonts w:ascii="Calibri" w:cs="Calibri" w:eastAsia="Calibri" w:hAnsi="Calibri"/>
-          <w:b/>
-          <w:bCs/>
-          <w:color w:val="0F6E6E"/>
-          <w:sz w:val="24"/>
-          <w:szCs w:val="24"/>
-        </w:rPr>
-        <w:t xml:space="preserve">First issue</w:t>
-      </w:r>
-    </w:p>
-    <w:p>
-      <w:pPr>
-        <w:spacing w:after="140"/>
-      </w:pPr>
-      <w:r>
-        <w:rPr>
-          <w:rFonts w:ascii="Calibri" w:cs="Calibri" w:eastAsia="Calibri" w:hAnsi="Calibri"/>
-          <w:i/>
-          <w:iCs/>
-          <w:color w:val="555555"/>
-          <w:sz w:val="21"/>
-          <w:szCs w:val="21"/>
-        </w:rPr>
-        <w:t xml:space="preserve">Thursday, August 20, 2026</w:t>
-      </w:r>
-    </w:p>
-    <w:p>
-      <w:pPr>
-        <w:pStyle w:val="ListParagraph"/>
-        <w:numPr>
-          <w:ilvl w:val="0"/>
-          <w:numId w:val="2"/>
-        </w:numPr>
-        <w:spacing w:after="80"/>
-      </w:pPr>
-      <w:r>
-        <w:rPr>
-          <w:rFonts w:ascii="Calibri" w:cs="Calibri" w:eastAsia="Calibri" w:hAnsi="Calibri"/>
-          <w:sz w:val="21"/>
-          <w:szCs w:val="21"/>
-        </w:rPr>
-        <w:t xml:space="preserve">Say "run the newsletter" in your project.</w:t>
-      </w:r>
-    </w:p>
-    <w:p>
-      <w:pPr>
-        <w:pStyle w:val="ListParagraph"/>
-        <w:numPr>
-          <w:ilvl w:val="0"/>
-          <w:numId w:val="2"/>
-        </w:numPr>
-        <w:spacing w:after="80"/>
-      </w:pPr>
-      <w:r>
-        <w:rPr>
-          <w:rFonts w:ascii="Calibri" w:cs="Calibri" w:eastAsia="Calibri" w:hAnsi="Calibri"/>
-          <w:sz w:val="21"/>
-          <w:szCs w:val="21"/>
-        </w:rPr>
-        <w:t xml:space="preserve">In the opening note, say what the chapter is, who runs it, when it arrives, and how to submit an event.</w:t>
-      </w:r>
-    </w:p>
-    <w:p>
-      <w:pPr>
-        <w:pStyle w:val="ListParagraph"/>
-        <w:numPr>
-          <w:ilvl w:val="0"/>
-          <w:numId w:val="2"/>
-        </w:numPr>
-        <w:spacing w:after="80"/>
-      </w:pPr>
-      <w:r>
-        <w:rPr>
-          <w:rFonts w:ascii="Calibri" w:cs="Calibri" w:eastAsia="Calibri" w:hAnsi="Calibri"/>
-          <w:sz w:val="21"/>
-          <w:szCs w:val="21"/>
-        </w:rPr>
-        <w:t xml:space="preserve">A new chapter runs 8 to 15 events an issue.</w:t>
-      </w:r>
-    </w:p>
-    <w:p>
-      <w:pPr>
-        <w:pStyle w:val="ListParagraph"/>
-        <w:numPr>
-          <w:ilvl w:val="0"/>
-          <w:numId w:val="2"/>
-        </w:numPr>
-        <w:spacing w:after="80"/>
-      </w:pPr>
-      <w:r>
-        <w:rPr>
-          <w:rFonts w:ascii="Calibri" w:cs="Calibri" w:eastAsia="Calibri" w:hAnsi="Calibri"/>
-          <w:sz w:val="21"/>
-          <w:szCs w:val="21"/>
-        </w:rPr>
-        <w:t xml:space="preserve">Every issue ends with the Join the Fun! block, which links the Climate Tech Cities event submission form and the volunteer form. Readers submit events through that form and the harvest picks them up.</w:t>
-      </w:r>
-    </w:p>
-    <w:p>
-      <w:pPr>
-        <w:pStyle w:val="Heading1"/>
-        <w:spacing w:after="160" w:before="320"/>
-      </w:pPr>
-      <w:r>
-        <w:rPr>
-          <w:rFonts w:ascii="Calibri" w:cs="Calibri" w:eastAsia="Calibri" w:hAnsi="Calibri"/>
-          <w:b/>
-          <w:bCs/>
-          <w:color w:val="0F6E6E"/>
-          <w:sz w:val="30"/>
-          <w:szCs w:val="30"/>
-        </w:rPr>
-        <w:t xml:space="preserve">Every week</w:t>
-      </w:r>
-    </w:p>
-    <w:p>
-      <w:pPr>
-        <w:spacing w:after="140"/>
-      </w:pPr>
-      <w:r>
-        <w:rPr>
-          <w:rFonts w:ascii="Calibri" w:cs="Calibri" w:eastAsia="Calibri" w:hAnsi="Calibri"/>
-          <w:sz w:val="21"/>
-          <w:szCs w:val="21"/>
-        </w:rPr>
-        <w:t xml:space="preserve">The issue goes out every Thursday. Run the four steps in one sitting or spread them across the week.</w:t>
+          <w:sz w:val="21"/>
+          <w:szCs w:val="21"/>
+        </w:rPr>
+        <w:t xml:space="preserve">The issue goes out every Tuesday. Run the four steps in one sitting or spread them across the week.</w:t>
       </w:r>
     </w:p>
     <w:tbl>
@@ -1631,7 +1522,7 @@
                 <w:sz w:val="20"/>
                 <w:szCs w:val="20"/>
               </w:rPr>
-              <w:t xml:space="preserve">ctc-harvest sweeps your sources and the submission form into a spreadsheet.</w:t>
+              <w:t xml:space="preserve">ctc-harvest sweeps your sources and the reader submission form into a spreadsheet.</w:t>
             </w:r>
           </w:p>
         </w:tc>
@@ -1749,7 +1640,7 @@
                 <w:sz w:val="20"/>
                 <w:szCs w:val="20"/>
               </w:rPr>
-              <w:t xml:space="preserve">ctc-assemble builds all ten blocks. The opening note, the picks, and the housekeeping arrive drafted, each with a yellow line above it. You rewrite those three in your own words and delete the yellow lines.</w:t>
+              <w:t xml:space="preserve">ctc-assemble builds the issue. You rewrite the opening note and picks in your own words.</w:t>
             </w:r>
           </w:p>
         </w:tc>
@@ -1808,7 +1699,7 @@
                 <w:sz w:val="20"/>
                 <w:szCs w:val="20"/>
               </w:rPr>
-              <w:t xml:space="preserve">Check the issue, paste into Substack, send. Then note the four reporting numbers listed in your settings file.</w:t>
+              <w:t xml:space="preserve">Check the issue, paste into Substack, send.</w:t>
             </w:r>
           </w:p>
         </w:tc>
@@ -1890,7 +1781,24 @@
           <w:sz w:val="21"/>
           <w:szCs w:val="21"/>
         </w:rPr>
-        <w:t xml:space="preserve">Add Opportunities_Denver.xlsx to your project as a context file, replacing the previous version.</w:t>
+        <w:t xml:space="preserve">Add Opportunities_Austin.xlsx to your project as a context file, replacing last month's copy. ctc-assemble reads it every week, so the opportunities block has something in it in every issue.</w:t>
+      </w:r>
+    </w:p>
+    <w:p>
+      <w:pPr>
+        <w:pStyle w:val="Heading1"/>
+        <w:spacing w:after="160" w:before="320"/>
+      </w:pPr>
+      <w:r>
+        <w:rPr>
+          <w:rFonts w:ascii="Calibri" w:cs="Calibri" w:eastAsia="Calibri" w:hAnsi="Calibri"/>
+          <w:b/>
+          <w:bCs/>
+          <w:color w:val="0F6E6E"/>
+          <w:sz w:val="30"/>
+          <w:szCs w:val="30"/>
+        </w:rPr>
+        <w:t xml:space="preserve">Every quarter</w:t>
       </w:r>
     </w:p>
     <w:p>
@@ -1908,7 +1816,7 @@
           <w:sz w:val="21"/>
           <w:szCs w:val="21"/>
         </w:rPr>
-        <w:t xml:space="preserve">ctc-assemble reads it for every issue, so the opportunities block has something in it all month.</w:t>
+        <w:t xml:space="preserve">Re-run ctc-source-map once every three months and replace CTC_Source_Registry_Austin.xlsx in your project. Sources go quiet without telling anyone, and the refresh catches a dead calendar before it thins out an issue.</w:t>
       </w:r>
     </w:p>
     <w:p>
@@ -1925,7 +1833,7 @@
           <w:sz w:val="30"/>
           <w:szCs w:val="30"/>
         </w:rPr>
-        <w:t xml:space="preserve">Every quarter</w:t>
+        <w:t xml:space="preserve">Once the newsletter is running</w:t>
       </w:r>
     </w:p>
     <w:p>
@@ -1943,7 +1851,7 @@
           <w:sz w:val="21"/>
           <w:szCs w:val="21"/>
         </w:rPr>
-        <w:t xml:space="preserve">Re-run ctc-source-map once every three months. Not monthly.</w:t>
+        <w:t xml:space="preserve">Run ctc-city-resources and name your city. It researches the ecosystem and builds your resource workbook.</w:t>
       </w:r>
     </w:p>
     <w:p>
@@ -1961,7 +1869,7 @@
           <w:sz w:val="21"/>
           <w:szCs w:val="21"/>
         </w:rPr>
-        <w:t xml:space="preserve">Sources die quietly. The quarterly refresh is what catches a dead calendar before it thins out an issue.</w:t>
+        <w:t xml:space="preserve">Then ctc-partner-list turns that workbook into a tiered list of who to approach and what to ask each one for.</w:t>
       </w:r>
     </w:p>
     <w:p>
@@ -1979,7 +1887,40 @@
           <w:sz w:val="21"/>
           <w:szCs w:val="21"/>
         </w:rPr>
-        <w:t xml:space="preserve">Nothing else in the toolkit runs on a quarterly cadence.</w:t>
+        <w:t xml:space="preserve">Then ctc-partner-outreach drafts the messages in your own voice.</w:t>
+      </w:r>
+    </w:p>
+    <w:p>
+      <w:pPr>
+        <w:spacing w:after="120"/>
+      </w:pPr>
+      <w:r>
+        <w:rPr>
+          <w:rFonts w:ascii="Calibri" w:cs="Calibri" w:eastAsia="Calibri" w:hAnsi="Calibri"/>
+          <w:sz w:val="21"/>
+          <w:szCs w:val="21"/>
+        </w:rPr>
+        <w:t xml:space="preserve"/>
+      </w:r>
+    </w:p>
+    <w:p>
+      <w:pPr>
+        <w:pBdr>
+          <w:left w:val="single" w:color="0F6E6E" w:sz="12" w:space="8"/>
+        </w:pBdr>
+        <w:spacing w:after="120"/>
+        <w:ind w:left="160"/>
+      </w:pPr>
+      <w:r>
+        <w:rPr>
+          <w:rFonts w:ascii="Calibri" w:cs="Calibri" w:eastAsia="Calibri" w:hAnsi="Calibri"/>
+          <w:i/>
+          <w:iCs/>
+          <w:color w:val="555555"/>
+          <w:sz w:val="20"/>
+          <w:szCs w:val="20"/>
+        </w:rPr>
+        <w:t xml:space="preserve">Partners are optional and have no deadline. Starting them before the newsletter is running is how leads end up finishing neither.</w:t>
       </w:r>
     </w:p>
     <w:p>
@@ -1996,7 +1937,7 @@
           <w:sz w:val="30"/>
           <w:szCs w:val="30"/>
         </w:rPr>
-        <w:t xml:space="preserve">Once the newsletter is running</w:t>
+        <w:t xml:space="preserve">If you miss a week</w:t>
       </w:r>
     </w:p>
     <w:p>
@@ -2014,25 +1955,7 @@
           <w:sz w:val="21"/>
           <w:szCs w:val="21"/>
         </w:rPr>
-        <w:t xml:space="preserve">Run ctc-partner-map. It researches your city, tiers the organizations to approach, and drafts outreach messages.</w:t>
-      </w:r>
-    </w:p>
-    <w:p>
-      <w:pPr>
-        <w:pStyle w:val="ListParagraph"/>
-        <w:numPr>
-          <w:ilvl w:val="0"/>
-          <w:numId w:val="2"/>
-        </w:numPr>
-        <w:spacing w:after="80"/>
-      </w:pPr>
-      <w:r>
-        <w:rPr>
-          <w:rFonts w:ascii="Calibri" w:cs="Calibri" w:eastAsia="Calibri" w:hAnsi="Calibri"/>
-          <w:sz w:val="21"/>
-          <w:szCs w:val="21"/>
-        </w:rPr>
-        <w:t xml:space="preserve">Work the Tier 1 list first.</w:t>
+        <w:t xml:space="preserve">Send the next issue on your usual send day. No apology or explanation needed. The target is weeks covered over a quarter, not consecutive weeks.</w:t>
       </w:r>
     </w:p>
     <w:p>
@@ -2049,95 +1972,6 @@
           <w:sz w:val="30"/>
           <w:szCs w:val="30"/>
         </w:rPr>
-        <w:t xml:space="preserve">If you miss a week</w:t>
-      </w:r>
-    </w:p>
-    <w:p>
-      <w:pPr>
-        <w:pStyle w:val="ListParagraph"/>
-        <w:numPr>
-          <w:ilvl w:val="0"/>
-          <w:numId w:val="2"/>
-        </w:numPr>
-        <w:spacing w:after="80"/>
-      </w:pPr>
-      <w:r>
-        <w:rPr>
-          <w:rFonts w:ascii="Calibri" w:cs="Calibri" w:eastAsia="Calibri" w:hAnsi="Calibri"/>
-          <w:sz w:val="21"/>
-          <w:szCs w:val="21"/>
-        </w:rPr>
-        <w:t xml:space="preserve">Send the next issue on your usual send day.</w:t>
-      </w:r>
-    </w:p>
-    <w:p>
-      <w:pPr>
-        <w:pStyle w:val="ListParagraph"/>
-        <w:numPr>
-          <w:ilvl w:val="0"/>
-          <w:numId w:val="2"/>
-        </w:numPr>
-        <w:spacing w:after="80"/>
-      </w:pPr>
-      <w:r>
-        <w:rPr>
-          <w:rFonts w:ascii="Calibri" w:cs="Calibri" w:eastAsia="Calibri" w:hAnsi="Calibri"/>
-          <w:sz w:val="21"/>
-          <w:szCs w:val="21"/>
-        </w:rPr>
-        <w:t xml:space="preserve">Do not include an apology or an explanation.</w:t>
-      </w:r>
-    </w:p>
-    <w:p>
-      <w:pPr>
-        <w:pStyle w:val="ListParagraph"/>
-        <w:numPr>
-          <w:ilvl w:val="0"/>
-          <w:numId w:val="2"/>
-        </w:numPr>
-        <w:spacing w:after="80"/>
-      </w:pPr>
-      <w:r>
-        <w:rPr>
-          <w:rFonts w:ascii="Calibri" w:cs="Calibri" w:eastAsia="Calibri" w:hAnsi="Calibri"/>
-          <w:sz w:val="21"/>
-          <w:szCs w:val="21"/>
-        </w:rPr>
-        <w:t xml:space="preserve">The target is weeks covered over a quarter, not consecutive weeks.</w:t>
-      </w:r>
-    </w:p>
-    <w:p>
-      <w:pPr>
-        <w:pStyle w:val="ListParagraph"/>
-        <w:numPr>
-          <w:ilvl w:val="0"/>
-          <w:numId w:val="2"/>
-        </w:numPr>
-        <w:spacing w:after="80"/>
-      </w:pPr>
-      <w:r>
-        <w:rPr>
-          <w:rFonts w:ascii="Calibri" w:cs="Calibri" w:eastAsia="Calibri" w:hAnsi="Calibri"/>
-          <w:sz w:val="21"/>
-          <w:szCs w:val="21"/>
-        </w:rPr>
-        <w:t xml:space="preserve">A missed week is not a reason to change your cadence. The newsletter cycle revisits cadence after your first few harvests, based on how many events your city produces.</w:t>
-      </w:r>
-    </w:p>
-    <w:p>
-      <w:pPr>
-        <w:pStyle w:val="Heading1"/>
-        <w:spacing w:after="160" w:before="320"/>
-      </w:pPr>
-      <w:r>
-        <w:rPr>
-          <w:rFonts w:ascii="Calibri" w:cs="Calibri" w:eastAsia="Calibri" w:hAnsi="Calibri"/>
-          <w:b/>
-          <w:bCs/>
-          <w:color w:val="0F6E6E"/>
-          <w:sz w:val="30"/>
-          <w:szCs w:val="30"/>
-        </w:rPr>
         <w:t xml:space="preserve">Files</w:t>
       </w:r>
     </w:p>
@@ -2151,7 +1985,7 @@
           <w:sz w:val="21"/>
           <w:szCs w:val="21"/>
         </w:rPr>
-        <w:t xml:space="preserve">Three of these go in your Claude project as context files.</w:t>
+        <w:t xml:space="preserve">Three files go in your Claude project as context files. Add the settings file now. Add the other two when the skills that create them hand them over.</w:t>
       </w:r>
     </w:p>
     <w:tbl>
@@ -2167,8 +2001,9 @@
         </w:tblBorders>
       </w:tblPr>
       <w:tblGrid>
-        <w:gridCol w:w="3000"/>
-        <w:gridCol w:w="5000"/>
+        <w:gridCol w:w="2900"/>
+        <w:gridCol w:w="1400"/>
+        <w:gridCol w:w="3700"/>
       </w:tblGrid>
       <w:tr>
         <w:trPr>
@@ -2176,7 +2011,7 @@
         </w:trPr>
         <w:tc>
           <w:tcPr>
-            <w:tcW w:type="dxa" w:w="3000"/>
+            <w:tcW w:type="dxa" w:w="2900"/>
             <w:shd w:fill="D9E2E1" w:color="auto" w:val="clear"/>
             <w:tcMar>
               <w:top w:type="dxa" w:w="80"/>
@@ -2203,7 +2038,34 @@
         </w:tc>
         <w:tc>
           <w:tcPr>
-            <w:tcW w:type="dxa" w:w="5000"/>
+            <w:tcW w:type="dxa" w:w="1400"/>
+            <w:shd w:fill="D9E2E1" w:color="auto" w:val="clear"/>
+            <w:tcMar>
+              <w:top w:type="dxa" w:w="80"/>
+              <w:left w:type="dxa" w:w="120"/>
+              <w:bottom w:type="dxa" w:w="80"/>
+              <w:right w:type="dxa" w:w="120"/>
+            </w:tcMar>
+          </w:tcPr>
+          <w:p>
+            <w:pPr>
+              <w:spacing w:after="0"/>
+            </w:pPr>
+            <w:r>
+              <w:rPr>
+                <w:rFonts w:ascii="Calibri" w:cs="Calibri" w:eastAsia="Calibri" w:hAnsi="Calibri"/>
+                <w:b/>
+                <w:bCs/>
+                <w:sz w:val="20"/>
+                <w:szCs w:val="20"/>
+              </w:rPr>
+              <w:t xml:space="preserve">Add it</w:t>
+            </w:r>
+          </w:p>
+        </w:tc>
+        <w:tc>
+          <w:tcPr>
+            <w:tcW w:type="dxa" w:w="3700"/>
             <w:shd w:fill="D9E2E1" w:color="auto" w:val="clear"/>
             <w:tcMar>
               <w:top w:type="dxa" w:w="80"/>
@@ -2235,55 +2097,82 @@
         </w:trPr>
         <w:tc>
           <w:tcPr>
-            <w:tcW w:type="dxa" w:w="3000"/>
-            <w:shd w:fill="DCE6F1" w:color="auto" w:val="clear"/>
-            <w:tcMar>
-              <w:top w:type="dxa" w:w="80"/>
-              <w:left w:type="dxa" w:w="120"/>
-              <w:bottom w:type="dxa" w:w="80"/>
-              <w:right w:type="dxa" w:w="120"/>
-            </w:tcMar>
-          </w:tcPr>
-          <w:p>
-            <w:pPr>
-              <w:spacing w:after="0"/>
-            </w:pPr>
-            <w:r>
-              <w:rPr>
-                <w:rFonts w:ascii="Calibri" w:cs="Calibri" w:eastAsia="Calibri" w:hAnsi="Calibri"/>
-                <w:b w:val="false"/>
-                <w:bCs w:val="false"/>
-                <w:sz w:val="20"/>
-                <w:szCs w:val="20"/>
-              </w:rPr>
-              <w:t xml:space="preserve">Chapter_Settings_Denver.docx</w:t>
-            </w:r>
-          </w:p>
-        </w:tc>
-        <w:tc>
-          <w:tcPr>
-            <w:tcW w:type="dxa" w:w="5000"/>
-            <w:shd w:fill="DCE6F1" w:color="auto" w:val="clear"/>
-            <w:tcMar>
-              <w:top w:type="dxa" w:w="80"/>
-              <w:left w:type="dxa" w:w="120"/>
-              <w:bottom w:type="dxa" w:w="80"/>
-              <w:right w:type="dxa" w:w="120"/>
-            </w:tcMar>
-          </w:tcPr>
-          <w:p>
-            <w:pPr>
-              <w:spacing w:after="0"/>
-            </w:pPr>
-            <w:r>
-              <w:rPr>
-                <w:rFonts w:ascii="Calibri" w:cs="Calibri" w:eastAsia="Calibri" w:hAnsi="Calibri"/>
-                <w:b w:val="false"/>
-                <w:bCs w:val="false"/>
-                <w:sz w:val="20"/>
-                <w:szCs w:val="20"/>
-              </w:rPr>
-              <w:t xml:space="preserve">Your settings. Add to the project as a context file.</w:t>
+            <w:tcW w:type="dxa" w:w="2900"/>
+            <w:shd w:fill="DCE6F1" w:color="auto" w:val="clear"/>
+            <w:tcMar>
+              <w:top w:type="dxa" w:w="80"/>
+              <w:left w:type="dxa" w:w="120"/>
+              <w:bottom w:type="dxa" w:w="80"/>
+              <w:right w:type="dxa" w:w="120"/>
+            </w:tcMar>
+          </w:tcPr>
+          <w:p>
+            <w:pPr>
+              <w:spacing w:after="0"/>
+            </w:pPr>
+            <w:r>
+              <w:rPr>
+                <w:rFonts w:ascii="Calibri" w:cs="Calibri" w:eastAsia="Calibri" w:hAnsi="Calibri"/>
+                <w:b w:val="false"/>
+                <w:bCs w:val="false"/>
+                <w:sz w:val="20"/>
+                <w:szCs w:val="20"/>
+              </w:rPr>
+              <w:t xml:space="preserve">Chapter_Settings_Austin.docx</w:t>
+            </w:r>
+          </w:p>
+        </w:tc>
+        <w:tc>
+          <w:tcPr>
+            <w:tcW w:type="dxa" w:w="1400"/>
+            <w:shd w:fill="DCE6F1" w:color="auto" w:val="clear"/>
+            <w:tcMar>
+              <w:top w:type="dxa" w:w="80"/>
+              <w:left w:type="dxa" w:w="120"/>
+              <w:bottom w:type="dxa" w:w="80"/>
+              <w:right w:type="dxa" w:w="120"/>
+            </w:tcMar>
+          </w:tcPr>
+          <w:p>
+            <w:pPr>
+              <w:spacing w:after="0"/>
+            </w:pPr>
+            <w:r>
+              <w:rPr>
+                <w:rFonts w:ascii="Calibri" w:cs="Calibri" w:eastAsia="Calibri" w:hAnsi="Calibri"/>
+                <w:b w:val="false"/>
+                <w:bCs w:val="false"/>
+                <w:sz w:val="20"/>
+                <w:szCs w:val="20"/>
+              </w:rPr>
+              <w:t xml:space="preserve">Now</w:t>
+            </w:r>
+          </w:p>
+        </w:tc>
+        <w:tc>
+          <w:tcPr>
+            <w:tcW w:type="dxa" w:w="3700"/>
+            <w:shd w:fill="DCE6F1" w:color="auto" w:val="clear"/>
+            <w:tcMar>
+              <w:top w:type="dxa" w:w="80"/>
+              <w:left w:type="dxa" w:w="120"/>
+              <w:bottom w:type="dxa" w:w="80"/>
+              <w:right w:type="dxa" w:w="120"/>
+            </w:tcMar>
+          </w:tcPr>
+          <w:p>
+            <w:pPr>
+              <w:spacing w:after="0"/>
+            </w:pPr>
+            <w:r>
+              <w:rPr>
+                <w:rFonts w:ascii="Calibri" w:cs="Calibri" w:eastAsia="Calibri" w:hAnsi="Calibri"/>
+                <w:b w:val="false"/>
+                <w:bCs w:val="false"/>
+                <w:sz w:val="20"/>
+                <w:szCs w:val="20"/>
+              </w:rPr>
+              <w:t xml:space="preserve">Your settings. Every skill reads it. Nothing else works until it is in the project.</w:t>
             </w:r>
           </w:p>
         </w:tc>
@@ -2294,55 +2183,82 @@
         </w:trPr>
         <w:tc>
           <w:tcPr>
-            <w:tcW w:type="dxa" w:w="3000"/>
-            <w:shd w:fill="DCE6F1" w:color="auto" w:val="clear"/>
-            <w:tcMar>
-              <w:top w:type="dxa" w:w="80"/>
-              <w:left w:type="dxa" w:w="120"/>
-              <w:bottom w:type="dxa" w:w="80"/>
-              <w:right w:type="dxa" w:w="120"/>
-            </w:tcMar>
-          </w:tcPr>
-          <w:p>
-            <w:pPr>
-              <w:spacing w:after="0"/>
-            </w:pPr>
-            <w:r>
-              <w:rPr>
-                <w:rFonts w:ascii="Calibri" w:cs="Calibri" w:eastAsia="Calibri" w:hAnsi="Calibri"/>
-                <w:b w:val="false"/>
-                <w:bCs w:val="false"/>
-                <w:sz w:val="20"/>
-                <w:szCs w:val="20"/>
-              </w:rPr>
-              <w:t xml:space="preserve">Your source list</w:t>
-            </w:r>
-          </w:p>
-        </w:tc>
-        <w:tc>
-          <w:tcPr>
-            <w:tcW w:type="dxa" w:w="5000"/>
-            <w:shd w:fill="DCE6F1" w:color="auto" w:val="clear"/>
-            <w:tcMar>
-              <w:top w:type="dxa" w:w="80"/>
-              <w:left w:type="dxa" w:w="120"/>
-              <w:bottom w:type="dxa" w:w="80"/>
-              <w:right w:type="dxa" w:w="120"/>
-            </w:tcMar>
-          </w:tcPr>
-          <w:p>
-            <w:pPr>
-              <w:spacing w:after="0"/>
-            </w:pPr>
-            <w:r>
-              <w:rPr>
-                <w:rFonts w:ascii="Calibri" w:cs="Calibri" w:eastAsia="Calibri" w:hAnsi="Calibri"/>
-                <w:b w:val="false"/>
-                <w:bCs w:val="false"/>
-                <w:sz w:val="20"/>
-                <w:szCs w:val="20"/>
-              </w:rPr>
-              <w:t xml:space="preserve">Created by ctc-source-map, which tells you the file name. Add to the project as a context file.</w:t>
+            <w:tcW w:type="dxa" w:w="2900"/>
+            <w:shd w:fill="DCE6F1" w:color="auto" w:val="clear"/>
+            <w:tcMar>
+              <w:top w:type="dxa" w:w="80"/>
+              <w:left w:type="dxa" w:w="120"/>
+              <w:bottom w:type="dxa" w:w="80"/>
+              <w:right w:type="dxa" w:w="120"/>
+            </w:tcMar>
+          </w:tcPr>
+          <w:p>
+            <w:pPr>
+              <w:spacing w:after="0"/>
+            </w:pPr>
+            <w:r>
+              <w:rPr>
+                <w:rFonts w:ascii="Calibri" w:cs="Calibri" w:eastAsia="Calibri" w:hAnsi="Calibri"/>
+                <w:b w:val="false"/>
+                <w:bCs w:val="false"/>
+                <w:sz w:val="20"/>
+                <w:szCs w:val="20"/>
+              </w:rPr>
+              <w:t xml:space="preserve">CTC_Source_Registry_Austin.xlsx</w:t>
+            </w:r>
+          </w:p>
+        </w:tc>
+        <w:tc>
+          <w:tcPr>
+            <w:tcW w:type="dxa" w:w="1400"/>
+            <w:shd w:fill="DCE6F1" w:color="auto" w:val="clear"/>
+            <w:tcMar>
+              <w:top w:type="dxa" w:w="80"/>
+              <w:left w:type="dxa" w:w="120"/>
+              <w:bottom w:type="dxa" w:w="80"/>
+              <w:right w:type="dxa" w:w="120"/>
+            </w:tcMar>
+          </w:tcPr>
+          <w:p>
+            <w:pPr>
+              <w:spacing w:after="0"/>
+            </w:pPr>
+            <w:r>
+              <w:rPr>
+                <w:rFonts w:ascii="Calibri" w:cs="Calibri" w:eastAsia="Calibri" w:hAnsi="Calibri"/>
+                <w:b w:val="false"/>
+                <w:bCs w:val="false"/>
+                <w:sz w:val="20"/>
+                <w:szCs w:val="20"/>
+              </w:rPr>
+              <w:t xml:space="preserve">Week 2</w:t>
+            </w:r>
+          </w:p>
+        </w:tc>
+        <w:tc>
+          <w:tcPr>
+            <w:tcW w:type="dxa" w:w="3700"/>
+            <w:shd w:fill="DCE6F1" w:color="auto" w:val="clear"/>
+            <w:tcMar>
+              <w:top w:type="dxa" w:w="80"/>
+              <w:left w:type="dxa" w:w="120"/>
+              <w:bottom w:type="dxa" w:w="80"/>
+              <w:right w:type="dxa" w:w="120"/>
+            </w:tcMar>
+          </w:tcPr>
+          <w:p>
+            <w:pPr>
+              <w:spacing w:after="0"/>
+            </w:pPr>
+            <w:r>
+              <w:rPr>
+                <w:rFonts w:ascii="Calibri" w:cs="Calibri" w:eastAsia="Calibri" w:hAnsi="Calibri"/>
+                <w:b w:val="false"/>
+                <w:bCs w:val="false"/>
+                <w:sz w:val="20"/>
+                <w:szCs w:val="20"/>
+              </w:rPr>
+              <w:t xml:space="preserve">Created by ctc-source-map. The weekly harvest reads it. Replace it at each quarterly refresh.</w:t>
             </w:r>
           </w:p>
         </w:tc>
@@ -2353,119 +2269,120 @@
         </w:trPr>
         <w:tc>
           <w:tcPr>
-            <w:tcW w:type="dxa" w:w="3000"/>
-            <w:shd w:fill="DCE6F1" w:color="auto" w:val="clear"/>
-            <w:tcMar>
-              <w:top w:type="dxa" w:w="80"/>
-              <w:left w:type="dxa" w:w="120"/>
-              <w:bottom w:type="dxa" w:w="80"/>
-              <w:right w:type="dxa" w:w="120"/>
-            </w:tcMar>
-          </w:tcPr>
-          <w:p>
-            <w:pPr>
-              <w:spacing w:after="0"/>
-            </w:pPr>
-            <w:r>
-              <w:rPr>
-                <w:rFonts w:ascii="Calibri" w:cs="Calibri" w:eastAsia="Calibri" w:hAnsi="Calibri"/>
-                <w:b w:val="false"/>
-                <w:bCs w:val="false"/>
-                <w:sz w:val="20"/>
-                <w:szCs w:val="20"/>
-              </w:rPr>
-              <w:t xml:space="preserve">Opportunities_Denver.xlsx</w:t>
-            </w:r>
-          </w:p>
-        </w:tc>
-        <w:tc>
-          <w:tcPr>
-            <w:tcW w:type="dxa" w:w="5000"/>
-            <w:shd w:fill="DCE6F1" w:color="auto" w:val="clear"/>
-            <w:tcMar>
-              <w:top w:type="dxa" w:w="80"/>
-              <w:left w:type="dxa" w:w="120"/>
-              <w:bottom w:type="dxa" w:w="80"/>
-              <w:right w:type="dxa" w:w="120"/>
-            </w:tcMar>
-          </w:tcPr>
-          <w:p>
-            <w:pPr>
-              <w:spacing w:after="0"/>
-            </w:pPr>
-            <w:r>
-              <w:rPr>
-                <w:rFonts w:ascii="Calibri" w:cs="Calibri" w:eastAsia="Calibri" w:hAnsi="Calibri"/>
-                <w:b w:val="false"/>
-                <w:bCs w:val="false"/>
-                <w:sz w:val="20"/>
-                <w:szCs w:val="20"/>
-              </w:rPr>
-              <w:t xml:space="preserve">Created monthly by ctc-opportunities. Add to the project as a context file.</w:t>
-            </w:r>
-          </w:p>
-        </w:tc>
-      </w:tr>
-      <w:tr>
-        <w:trPr>
-          <w:tblHeader w:val="false"/>
-        </w:trPr>
-        <w:tc>
-          <w:tcPr>
-            <w:tcW w:type="dxa" w:w="3000"/>
-            <w:shd w:fill="DCE6F1" w:color="auto" w:val="clear"/>
-            <w:tcMar>
-              <w:top w:type="dxa" w:w="80"/>
-              <w:left w:type="dxa" w:w="120"/>
-              <w:bottom w:type="dxa" w:w="80"/>
-              <w:right w:type="dxa" w:w="120"/>
-            </w:tcMar>
-          </w:tcPr>
-          <w:p>
-            <w:pPr>
-              <w:spacing w:after="0"/>
-            </w:pPr>
-            <w:r>
-              <w:rPr>
-                <w:rFonts w:ascii="Calibri" w:cs="Calibri" w:eastAsia="Calibri" w:hAnsi="Calibri"/>
-                <w:b w:val="false"/>
-                <w:bCs w:val="false"/>
-                <w:sz w:val="20"/>
-                <w:szCs w:val="20"/>
-              </w:rPr>
-              <w:t xml:space="preserve">Chapter_Plan_Denver.docx</w:t>
-            </w:r>
-          </w:p>
-        </w:tc>
-        <w:tc>
-          <w:tcPr>
-            <w:tcW w:type="dxa" w:w="5000"/>
-            <w:shd w:fill="DCE6F1" w:color="auto" w:val="clear"/>
-            <w:tcMar>
-              <w:top w:type="dxa" w:w="80"/>
-              <w:left w:type="dxa" w:w="120"/>
-              <w:bottom w:type="dxa" w:w="80"/>
-              <w:right w:type="dxa" w:w="120"/>
-            </w:tcMar>
-          </w:tcPr>
-          <w:p>
-            <w:pPr>
-              <w:spacing w:after="0"/>
-            </w:pPr>
-            <w:r>
-              <w:rPr>
-                <w:rFonts w:ascii="Calibri" w:cs="Calibri" w:eastAsia="Calibri" w:hAnsi="Calibri"/>
-                <w:b w:val="false"/>
-                <w:bCs w:val="false"/>
-                <w:sz w:val="20"/>
-                <w:szCs w:val="20"/>
-              </w:rPr>
-              <w:t xml:space="preserve">This document. For reference, not needed in the project.</w:t>
+            <w:tcW w:type="dxa" w:w="2900"/>
+            <w:shd w:fill="DCE6F1" w:color="auto" w:val="clear"/>
+            <w:tcMar>
+              <w:top w:type="dxa" w:w="80"/>
+              <w:left w:type="dxa" w:w="120"/>
+              <w:bottom w:type="dxa" w:w="80"/>
+              <w:right w:type="dxa" w:w="120"/>
+            </w:tcMar>
+          </w:tcPr>
+          <w:p>
+            <w:pPr>
+              <w:spacing w:after="0"/>
+            </w:pPr>
+            <w:r>
+              <w:rPr>
+                <w:rFonts w:ascii="Calibri" w:cs="Calibri" w:eastAsia="Calibri" w:hAnsi="Calibri"/>
+                <w:b w:val="false"/>
+                <w:bCs w:val="false"/>
+                <w:sz w:val="20"/>
+                <w:szCs w:val="20"/>
+              </w:rPr>
+              <w:t xml:space="preserve">Opportunities_Austin.xlsx</w:t>
+            </w:r>
+          </w:p>
+        </w:tc>
+        <w:tc>
+          <w:tcPr>
+            <w:tcW w:type="dxa" w:w="1400"/>
+            <w:shd w:fill="DCE6F1" w:color="auto" w:val="clear"/>
+            <w:tcMar>
+              <w:top w:type="dxa" w:w="80"/>
+              <w:left w:type="dxa" w:w="120"/>
+              <w:bottom w:type="dxa" w:w="80"/>
+              <w:right w:type="dxa" w:w="120"/>
+            </w:tcMar>
+          </w:tcPr>
+          <w:p>
+            <w:pPr>
+              <w:spacing w:after="0"/>
+            </w:pPr>
+            <w:r>
+              <w:rPr>
+                <w:rFonts w:ascii="Calibri" w:cs="Calibri" w:eastAsia="Calibri" w:hAnsi="Calibri"/>
+                <w:b w:val="false"/>
+                <w:bCs w:val="false"/>
+                <w:sz w:val="20"/>
+                <w:szCs w:val="20"/>
+              </w:rPr>
+              <w:t xml:space="preserve">Monthly</w:t>
+            </w:r>
+          </w:p>
+        </w:tc>
+        <w:tc>
+          <w:tcPr>
+            <w:tcW w:type="dxa" w:w="3700"/>
+            <w:shd w:fill="DCE6F1" w:color="auto" w:val="clear"/>
+            <w:tcMar>
+              <w:top w:type="dxa" w:w="80"/>
+              <w:left w:type="dxa" w:w="120"/>
+              <w:bottom w:type="dxa" w:w="80"/>
+              <w:right w:type="dxa" w:w="120"/>
+            </w:tcMar>
+          </w:tcPr>
+          <w:p>
+            <w:pPr>
+              <w:spacing w:after="0"/>
+            </w:pPr>
+            <w:r>
+              <w:rPr>
+                <w:rFonts w:ascii="Calibri" w:cs="Calibri" w:eastAsia="Calibri" w:hAnsi="Calibri"/>
+                <w:b w:val="false"/>
+                <w:bCs w:val="false"/>
+                <w:sz w:val="20"/>
+                <w:szCs w:val="20"/>
+              </w:rPr>
+              <w:t xml:space="preserve">Created by ctc-opportunities. Replace last month's copy each time.</w:t>
             </w:r>
           </w:p>
         </w:tc>
       </w:tr>
     </w:tbl>
+    <w:p>
+      <w:pPr>
+        <w:spacing w:after="120"/>
+      </w:pPr>
+      <w:r>
+        <w:rPr>
+          <w:rFonts w:ascii="Calibri" w:cs="Calibri" w:eastAsia="Calibri" w:hAnsi="Calibri"/>
+          <w:sz w:val="21"/>
+          <w:szCs w:val="21"/>
+        </w:rPr>
+        <w:t xml:space="preserve"/>
+      </w:r>
+    </w:p>
+    <w:p>
+      <w:pPr>
+        <w:pBdr>
+          <w:left w:val="single" w:color="0F6E6E" w:sz="12" w:space="8"/>
+        </w:pBdr>
+        <w:spacing w:after="120"/>
+        <w:ind w:left="160"/>
+      </w:pPr>
+      <w:r>
+        <w:rPr>
+          <w:rFonts w:ascii="Calibri" w:cs="Calibri" w:eastAsia="Calibri" w:hAnsi="Calibri"/>
+          <w:i/>
+          <w:iCs/>
+          <w:color w:val="555555"/>
+          <w:sz w:val="20"/>
+          <w:szCs w:val="20"/>
+        </w:rPr>
+        <w:t xml:space="preserve">Keep Chapter_Plan_Austin.docx for reference. It is the only one of the four that does not go in the project.</w:t>
+      </w:r>
+    </w:p>
     <w:sectPr>
       <w:pgSz w:w="12240" w:h="15840" w:orient="portrait"/>
       <w:pgMar w:top="1080" w:right="1080" w:bottom="1080" w:left="1080" w:header="708" w:footer="708" w:gutter="0"/>

</xml_diff>